<commit_message>
Refactor: opendataloader-pdf로 교체 및 output docx sample 수정
</commit_message>
<xml_diff>
--- a/examples/sample_output.docx
+++ b/examples/sample_output.docx
@@ -8,7 +8,7 @@
         <w:jc w:val="center"/>
       </w:pPr>
       <w:r>
-        <w:t>문서 분석 리포트: sample_input.pdf</w:t>
+        <w:t>문서 분석 리포트: test_input.pdf</w:t>
       </w:r>
     </w:p>
     <w:p/>
@@ -31,11 +31,8 @@
       </w:r>
     </w:p>
     <w:p>
-      <w:pPr>
-        <w:ind w:left="432"/>
-      </w:pPr>
       <w:r>
-        <w:t>본 보고서는 금융 분야, 특히 은행권을 중심으로 한 인공지능(AI) 시장의 전망과 활용 현황을 분석합니다. AI는 금융 산업에서 수익 창출, 고객 경험 제고, 비용 절감, 규제 대응 등 다양한 목적으로 도입되고 있으며, 관련 시장은 높은 성장률을 보일 것으로 전망됩니다. 성공적인 AI 도입을 위해 기술 융합, 데이터 활용 역량 강화, 그리고 설명 가능한 AI(XAI)를 통한 사회적 신뢰 구축이 중요합니다.</w:t>
+        <w:t>본 보고서는 인공지능(AI) 시장의 전반적인 전망과 함께 금융 분야, 특히 은행권에서의 AI 활용 현황 및 미래 전망을 다룹니다. AI 시장은 급격한 성장세를 보이고 있으며, 금융 분야는 AI 시장에서 가장 큰 비중을 차지하고 있습니다. 금융권에서는 신용평가, 자산관리, 운영 비용 절감, 규제 대응 등 다양한 목적으로 AI를 도입하고 있으며, 향후 마이데이터 사업 등과 연계하여 더욱 발전할 것으로 전망됩니다.</w:t>
       </w:r>
     </w:p>
     <w:p/>
@@ -44,9 +41,94 @@
         <w:pStyle w:val="Heading1"/>
       </w:pPr>
       <w:r>
-        <w:t>주요 수치 및 데이터</w:t>
+        <w:t>핵심 인사이트</w:t>
       </w:r>
     </w:p>
+    <w:p>
+      <w:pPr>
+        <w:pStyle w:val="ListBullet"/>
+      </w:pPr>
+      <w:r>
+        <w:t>전 세계 AI 시장은 2021년 581억 달러에서 2026년 3,095억 달러로 연평균 39.7% 성장할 것으로 전망되며, 금융 분야는 2021년 기준 약 19%의 비중을 차지합니다.</w:t>
+      </w:r>
+    </w:p>
+    <w:p>
+      <w:pPr>
+        <w:pStyle w:val="ListBullet"/>
+      </w:pPr>
+      <w:r>
+        <w:t>국내 금융 AI 시장은 2021년 6천억 원에서 2026년 3.2조 원으로 연평균 38.2% 성장할 것으로 예상됩니다.</w:t>
+      </w:r>
+    </w:p>
+    <w:p>
+      <w:pPr>
+        <w:pStyle w:val="ListBullet"/>
+      </w:pPr>
+      <w:r>
+        <w:t>금융 분야에서 AI는 신규 수익 창출, 고객 경험 제고, 운영 비용 절감, 규제 대응 및 이상거래 탐지 등 네 가지 주요 유형으로 활용되고 있습니다.</w:t>
+      </w:r>
+    </w:p>
+    <w:p>
+      <w:pPr>
+        <w:pStyle w:val="ListBullet"/>
+      </w:pPr>
+      <w:r>
+        <w:t>은행권에서는 신용평가·신용대출, 자산관리·RPA, 이상거래탐지·리스크 모니터링, 콜센터·민원처리 등에 AI를 활용하고 있으며, 이러한 자동화 및 데이터 처리 기반 업무에서 정량적, 정성적 성과가 검증되고 있습니다.</w:t>
+      </w:r>
+    </w:p>
+    <w:p>
+      <w:pPr>
+        <w:pStyle w:val="ListBullet"/>
+      </w:pPr>
+      <w:r>
+        <w:t>향후 AI 도입 투자는 확대될 것이며, 서비스 측면에서는 차별화, 사용 편의성, 보안성이 강화될 것이고, 업무 측면에서는 전사적 업무 사이클로 적용이 확대될 것입니다.</w:t>
+      </w:r>
+    </w:p>
+    <w:p>
+      <w:pPr>
+        <w:pStyle w:val="ListBullet"/>
+      </w:pPr>
+      <w:r>
+        <w:t>성공적인 AI 도입을 위해 다양한 미래 기술 융합 역량과 함께 공정하고 설명 가능한 AI(XAI) 구현을 통한 사회적 신뢰 구축이 중요합니다.</w:t>
+      </w:r>
+    </w:p>
+    <w:p/>
+    <w:p>
+      <w:pPr>
+        <w:pStyle w:val="Heading1"/>
+      </w:pPr>
+      <w:r>
+        <w:t>섹션별 분석</w:t>
+      </w:r>
+    </w:p>
+    <w:p>
+      <w:pPr>
+        <w:pStyle w:val="Heading2"/>
+      </w:pPr>
+      <w:r>
+        <w:t>1. 들어가며</w:t>
+      </w:r>
+    </w:p>
+    <w:p>
+      <w:r>
+        <w:t>본 섹션은 인공지능의 정의와 금융 분야, 특히 은행권에서의 AI 도입 필요성 및 보고서의 목적을 설명합니다. 디지털 금융 플랫폼의 부상과 경쟁력 확보를 위해 금융기관들이 AI 도입에 투자하고 있음을 강조합니다.</w:t>
+      </w:r>
+    </w:p>
+    <w:p/>
+    <w:p>
+      <w:pPr>
+        <w:pStyle w:val="Heading2"/>
+      </w:pPr>
+      <w:r>
+        <w:t>2. 인공지능 시장과 금융 AI 시장 전망</w:t>
+      </w:r>
+    </w:p>
+    <w:p>
+      <w:r>
+        <w:t>전 세계 AI 시장은 2021년 581억 달러에서 2026년 3,095억 달러로 연평균 39.7% 성장할 것으로 전망되며, 금융 분야가 19.4%로 가장 큰 비중을 차지합니다. 국내 AI 시장은 2021년 3.2조 원에서 2026년 17.4조 원으로 연평균 40.2% 성장할 것으로 예상되며, 국내 금융 AI 시장은 2021년 6천억 원에서 2026년 3.2조 원으로 연평균 38.2% 성장할 것으로 전망됩니다. 특히 신용평가, 고객 경험 제고, 로봇 자동화 분야가 금융 AI 시장의 주요 부분을 차지합니다.</w:t>
+      </w:r>
+    </w:p>
+    <w:p/>
     <w:tbl>
       <w:tblPr>
         <w:tblStyle w:val="TableGrid"/>
@@ -54,39 +136,158 @@
         <w:tblLook w:firstColumn="1" w:firstRow="1" w:lastColumn="0" w:lastRow="0" w:noHBand="0" w:noVBand="1" w:val="04A0"/>
       </w:tblPr>
       <w:tblGrid>
-        <w:gridCol w:w="4320"/>
-        <w:gridCol w:w="4320"/>
+        <w:gridCol w:w="785"/>
+        <w:gridCol w:w="785"/>
+        <w:gridCol w:w="785"/>
+        <w:gridCol w:w="785"/>
+        <w:gridCol w:w="785"/>
+        <w:gridCol w:w="785"/>
+        <w:gridCol w:w="785"/>
+        <w:gridCol w:w="785"/>
+        <w:gridCol w:w="785"/>
+        <w:gridCol w:w="785"/>
+        <w:gridCol w:w="785"/>
       </w:tblGrid>
       <w:tr>
         <w:tc>
           <w:tcPr>
-            <w:tcW w:type="dxa" w:w="4320"/>
+            <w:tcW w:type="dxa" w:w="785"/>
           </w:tcPr>
           <w:p>
-            <w:pPr>
-              <w:jc w:val="center"/>
-            </w:pPr>
             <w:r>
               <w:rPr>
                 <w:b/>
               </w:rPr>
-              <w:t>항목</w:t>
+              <w:t>구분</w:t>
             </w:r>
           </w:p>
         </w:tc>
         <w:tc>
           <w:tcPr>
-            <w:tcW w:type="dxa" w:w="4320"/>
+            <w:tcW w:type="dxa" w:w="785"/>
           </w:tcPr>
           <w:p>
-            <w:pPr>
-              <w:jc w:val="center"/>
-            </w:pPr>
             <w:r>
               <w:rPr>
                 <w:b/>
               </w:rPr>
-              <w:t>수치/내용</w:t>
+            </w:r>
+          </w:p>
+        </w:tc>
+        <w:tc>
+          <w:tcPr>
+            <w:tcW w:type="dxa" w:w="785"/>
+          </w:tcPr>
+          <w:p>
+            <w:r>
+              <w:rPr>
+                <w:b/>
+              </w:rPr>
+              <w:t>2019년</w:t>
+            </w:r>
+          </w:p>
+        </w:tc>
+        <w:tc>
+          <w:tcPr>
+            <w:tcW w:type="dxa" w:w="785"/>
+          </w:tcPr>
+          <w:p>
+            <w:r>
+              <w:rPr>
+                <w:b/>
+              </w:rPr>
+              <w:t>2020년</w:t>
+            </w:r>
+          </w:p>
+        </w:tc>
+        <w:tc>
+          <w:tcPr>
+            <w:tcW w:type="dxa" w:w="785"/>
+          </w:tcPr>
+          <w:p>
+            <w:r>
+              <w:rPr>
+                <w:b/>
+              </w:rPr>
+              <w:t>2021년(p)</w:t>
+            </w:r>
+          </w:p>
+        </w:tc>
+        <w:tc>
+          <w:tcPr>
+            <w:tcW w:type="dxa" w:w="785"/>
+          </w:tcPr>
+          <w:p>
+            <w:r>
+              <w:rPr>
+                <w:b/>
+              </w:rPr>
+              <w:t>2022년(E)</w:t>
+            </w:r>
+          </w:p>
+        </w:tc>
+        <w:tc>
+          <w:tcPr>
+            <w:tcW w:type="dxa" w:w="785"/>
+          </w:tcPr>
+          <w:p>
+            <w:r>
+              <w:rPr>
+                <w:b/>
+              </w:rPr>
+              <w:t>2023년(E)</w:t>
+            </w:r>
+          </w:p>
+        </w:tc>
+        <w:tc>
+          <w:tcPr>
+            <w:tcW w:type="dxa" w:w="785"/>
+          </w:tcPr>
+          <w:p>
+            <w:r>
+              <w:rPr>
+                <w:b/>
+              </w:rPr>
+              <w:t>2024년(E)</w:t>
+            </w:r>
+          </w:p>
+        </w:tc>
+        <w:tc>
+          <w:tcPr>
+            <w:tcW w:type="dxa" w:w="785"/>
+          </w:tcPr>
+          <w:p>
+            <w:r>
+              <w:rPr>
+                <w:b/>
+              </w:rPr>
+              <w:t>2025년(E)</w:t>
+            </w:r>
+          </w:p>
+        </w:tc>
+        <w:tc>
+          <w:tcPr>
+            <w:tcW w:type="dxa" w:w="785"/>
+          </w:tcPr>
+          <w:p>
+            <w:r>
+              <w:rPr>
+                <w:b/>
+              </w:rPr>
+              <w:t>2026년(E)</w:t>
+            </w:r>
+          </w:p>
+        </w:tc>
+        <w:tc>
+          <w:tcPr>
+            <w:tcW w:type="dxa" w:w="785"/>
+          </w:tcPr>
+          <w:p>
+            <w:r>
+              <w:rPr>
+                <w:b/>
+              </w:rPr>
+              <w:t>CAGR(%) (‘21~’26)</w:t>
             </w:r>
           </w:p>
         </w:tc>
@@ -94,61 +295,105 @@
       <w:tr>
         <w:tc>
           <w:tcPr>
-            <w:tcW w:type="dxa" w:w="4320"/>
+            <w:tcW w:type="dxa" w:w="785"/>
           </w:tcPr>
           <w:p>
             <w:r>
-              <w:t>세계 AI 시장 규모 (2021년)</w:t>
+              <w:t>시장규모</w:t>
             </w:r>
           </w:p>
         </w:tc>
         <w:tc>
           <w:tcPr>
-            <w:tcW w:type="dxa" w:w="4320"/>
+            <w:tcW w:type="dxa" w:w="785"/>
+          </w:tcPr>
+          <w:p>
+            <w:r/>
+          </w:p>
+        </w:tc>
+        <w:tc>
+          <w:tcPr>
+            <w:tcW w:type="dxa" w:w="785"/>
           </w:tcPr>
           <w:p>
             <w:r>
-              <w:t>581억 달러</w:t>
-            </w:r>
-          </w:p>
-        </w:tc>
-      </w:tr>
-      <w:tr>
-        <w:tc>
-          <w:tcPr>
-            <w:tcW w:type="dxa" w:w="4320"/>
-          </w:tcPr>
-          <w:p>
-            <w:r>
-              <w:t>세계 AI 시장 규모 전망 (2026년)</w:t>
+              <w:t>289</w:t>
             </w:r>
           </w:p>
         </w:tc>
         <w:tc>
           <w:tcPr>
-            <w:tcW w:type="dxa" w:w="4320"/>
+            <w:tcW w:type="dxa" w:w="785"/>
           </w:tcPr>
           <w:p>
             <w:r>
-              <w:t>3,095억 달러</w:t>
-            </w:r>
-          </w:p>
-        </w:tc>
-      </w:tr>
-      <w:tr>
-        <w:tc>
-          <w:tcPr>
-            <w:tcW w:type="dxa" w:w="4320"/>
-          </w:tcPr>
-          <w:p>
-            <w:r>
-              <w:t>세계 AI 시장 연평균 성장률 (2021-2026)</w:t>
+              <w:t>377</w:t>
             </w:r>
           </w:p>
         </w:tc>
         <w:tc>
           <w:tcPr>
-            <w:tcW w:type="dxa" w:w="4320"/>
+            <w:tcW w:type="dxa" w:w="785"/>
+          </w:tcPr>
+          <w:p>
+            <w:r>
+              <w:t>581</w:t>
+            </w:r>
+          </w:p>
+        </w:tc>
+        <w:tc>
+          <w:tcPr>
+            <w:tcW w:type="dxa" w:w="785"/>
+          </w:tcPr>
+          <w:p>
+            <w:r>
+              <w:t>869</w:t>
+            </w:r>
+          </w:p>
+        </w:tc>
+        <w:tc>
+          <w:tcPr>
+            <w:tcW w:type="dxa" w:w="785"/>
+          </w:tcPr>
+          <w:p>
+            <w:r>
+              <w:t>1,252</w:t>
+            </w:r>
+          </w:p>
+        </w:tc>
+        <w:tc>
+          <w:tcPr>
+            <w:tcW w:type="dxa" w:w="785"/>
+          </w:tcPr>
+          <w:p>
+            <w:r>
+              <w:t>1,742</w:t>
+            </w:r>
+          </w:p>
+        </w:tc>
+        <w:tc>
+          <w:tcPr>
+            <w:tcW w:type="dxa" w:w="785"/>
+          </w:tcPr>
+          <w:p>
+            <w:r>
+              <w:t>2,337</w:t>
+            </w:r>
+          </w:p>
+        </w:tc>
+        <w:tc>
+          <w:tcPr>
+            <w:tcW w:type="dxa" w:w="785"/>
+          </w:tcPr>
+          <w:p>
+            <w:r>
+              <w:t>3,095</w:t>
+            </w:r>
+          </w:p>
+        </w:tc>
+        <w:tc>
+          <w:tcPr>
+            <w:tcW w:type="dxa" w:w="785"/>
           </w:tcPr>
           <w:p>
             <w:r>
@@ -160,21 +405,109 @@
       <w:tr>
         <w:tc>
           <w:tcPr>
-            <w:tcW w:type="dxa" w:w="4320"/>
+            <w:tcW w:type="dxa" w:w="785"/>
+          </w:tcPr>
+          <w:p>
+            <w:r/>
+          </w:p>
+        </w:tc>
+        <w:tc>
+          <w:tcPr>
+            <w:tcW w:type="dxa" w:w="785"/>
           </w:tcPr>
           <w:p>
             <w:r>
-              <w:t>금융 분야 AI 시장 비중 (2021년)</w:t>
+              <w:t>금융</w:t>
             </w:r>
           </w:p>
         </w:tc>
         <w:tc>
           <w:tcPr>
-            <w:tcW w:type="dxa" w:w="4320"/>
+            <w:tcW w:type="dxa" w:w="785"/>
           </w:tcPr>
           <w:p>
             <w:r>
-              <w:t>19.4%</w:t>
+              <w:t>57</w:t>
+            </w:r>
+          </w:p>
+        </w:tc>
+        <w:tc>
+          <w:tcPr>
+            <w:tcW w:type="dxa" w:w="785"/>
+          </w:tcPr>
+          <w:p>
+            <w:r>
+              <w:t>74</w:t>
+            </w:r>
+          </w:p>
+        </w:tc>
+        <w:tc>
+          <w:tcPr>
+            <w:tcW w:type="dxa" w:w="785"/>
+          </w:tcPr>
+          <w:p>
+            <w:r>
+              <w:t>113</w:t>
+            </w:r>
+          </w:p>
+        </w:tc>
+        <w:tc>
+          <w:tcPr>
+            <w:tcW w:type="dxa" w:w="785"/>
+          </w:tcPr>
+          <w:p>
+            <w:r>
+              <w:t>167</w:t>
+            </w:r>
+          </w:p>
+        </w:tc>
+        <w:tc>
+          <w:tcPr>
+            <w:tcW w:type="dxa" w:w="785"/>
+          </w:tcPr>
+          <w:p>
+            <w:r>
+              <w:t>238</w:t>
+            </w:r>
+          </w:p>
+        </w:tc>
+        <w:tc>
+          <w:tcPr>
+            <w:tcW w:type="dxa" w:w="785"/>
+          </w:tcPr>
+          <w:p>
+            <w:r>
+              <w:t>327</w:t>
+            </w:r>
+          </w:p>
+        </w:tc>
+        <w:tc>
+          <w:tcPr>
+            <w:tcW w:type="dxa" w:w="785"/>
+          </w:tcPr>
+          <w:p>
+            <w:r>
+              <w:t>433</w:t>
+            </w:r>
+          </w:p>
+        </w:tc>
+        <w:tc>
+          <w:tcPr>
+            <w:tcW w:type="dxa" w:w="785"/>
+          </w:tcPr>
+          <w:p>
+            <w:r>
+              <w:t>562</w:t>
+            </w:r>
+          </w:p>
+        </w:tc>
+        <w:tc>
+          <w:tcPr>
+            <w:tcW w:type="dxa" w:w="785"/>
+          </w:tcPr>
+          <w:p>
+            <w:r>
+              <w:t>37.8%</w:t>
             </w:r>
           </w:p>
         </w:tc>
@@ -182,21 +515,109 @@
       <w:tr>
         <w:tc>
           <w:tcPr>
-            <w:tcW w:type="dxa" w:w="4320"/>
+            <w:tcW w:type="dxa" w:w="785"/>
+          </w:tcPr>
+          <w:p>
+            <w:r/>
+          </w:p>
+        </w:tc>
+        <w:tc>
+          <w:tcPr>
+            <w:tcW w:type="dxa" w:w="785"/>
           </w:tcPr>
           <w:p>
             <w:r>
-              <w:t>국내 AI 시장 규모 (2021년)</w:t>
+              <w:t>IT</w:t>
             </w:r>
           </w:p>
         </w:tc>
         <w:tc>
           <w:tcPr>
-            <w:tcW w:type="dxa" w:w="4320"/>
+            <w:tcW w:type="dxa" w:w="785"/>
           </w:tcPr>
           <w:p>
             <w:r>
-              <w:t>3.2조 원</w:t>
+              <w:t>48</w:t>
+            </w:r>
+          </w:p>
+        </w:tc>
+        <w:tc>
+          <w:tcPr>
+            <w:tcW w:type="dxa" w:w="785"/>
+          </w:tcPr>
+          <w:p>
+            <w:r>
+              <w:t>62</w:t>
+            </w:r>
+          </w:p>
+        </w:tc>
+        <w:tc>
+          <w:tcPr>
+            <w:tcW w:type="dxa" w:w="785"/>
+          </w:tcPr>
+          <w:p>
+            <w:r>
+              <w:t>96</w:t>
+            </w:r>
+          </w:p>
+        </w:tc>
+        <w:tc>
+          <w:tcPr>
+            <w:tcW w:type="dxa" w:w="785"/>
+          </w:tcPr>
+          <w:p>
+            <w:r>
+              <w:t>142</w:t>
+            </w:r>
+          </w:p>
+        </w:tc>
+        <w:tc>
+          <w:tcPr>
+            <w:tcW w:type="dxa" w:w="785"/>
+          </w:tcPr>
+          <w:p>
+            <w:r>
+              <w:t>203</w:t>
+            </w:r>
+          </w:p>
+        </w:tc>
+        <w:tc>
+          <w:tcPr>
+            <w:tcW w:type="dxa" w:w="785"/>
+          </w:tcPr>
+          <w:p>
+            <w:r>
+              <w:t>281</w:t>
+            </w:r>
+          </w:p>
+        </w:tc>
+        <w:tc>
+          <w:tcPr>
+            <w:tcW w:type="dxa" w:w="785"/>
+          </w:tcPr>
+          <w:p>
+            <w:r>
+              <w:t>375</w:t>
+            </w:r>
+          </w:p>
+        </w:tc>
+        <w:tc>
+          <w:tcPr>
+            <w:tcW w:type="dxa" w:w="785"/>
+          </w:tcPr>
+          <w:p>
+            <w:r>
+              <w:t>494</w:t>
+            </w:r>
+          </w:p>
+        </w:tc>
+        <w:tc>
+          <w:tcPr>
+            <w:tcW w:type="dxa" w:w="785"/>
+          </w:tcPr>
+          <w:p>
+            <w:r>
+              <w:t>38.8%</w:t>
             </w:r>
           </w:p>
         </w:tc>
@@ -204,21 +625,109 @@
       <w:tr>
         <w:tc>
           <w:tcPr>
-            <w:tcW w:type="dxa" w:w="4320"/>
+            <w:tcW w:type="dxa" w:w="785"/>
+          </w:tcPr>
+          <w:p>
+            <w:r/>
+          </w:p>
+        </w:tc>
+        <w:tc>
+          <w:tcPr>
+            <w:tcW w:type="dxa" w:w="785"/>
           </w:tcPr>
           <w:p>
             <w:r>
-              <w:t>국내 AI 시장 규모 전망 (2026년)</w:t>
+              <w:t>소매 및 전자상거래</w:t>
             </w:r>
           </w:p>
         </w:tc>
         <w:tc>
           <w:tcPr>
-            <w:tcW w:type="dxa" w:w="4320"/>
+            <w:tcW w:type="dxa" w:w="785"/>
           </w:tcPr>
           <w:p>
             <w:r>
-              <w:t>17.4조 원</w:t>
+              <w:t>42</w:t>
+            </w:r>
+          </w:p>
+        </w:tc>
+        <w:tc>
+          <w:tcPr>
+            <w:tcW w:type="dxa" w:w="785"/>
+          </w:tcPr>
+          <w:p>
+            <w:r>
+              <w:t>55</w:t>
+            </w:r>
+          </w:p>
+        </w:tc>
+        <w:tc>
+          <w:tcPr>
+            <w:tcW w:type="dxa" w:w="785"/>
+          </w:tcPr>
+          <w:p>
+            <w:r>
+              <w:t>86</w:t>
+            </w:r>
+          </w:p>
+        </w:tc>
+        <w:tc>
+          <w:tcPr>
+            <w:tcW w:type="dxa" w:w="785"/>
+          </w:tcPr>
+          <w:p>
+            <w:r>
+              <w:t>130</w:t>
+            </w:r>
+          </w:p>
+        </w:tc>
+        <w:tc>
+          <w:tcPr>
+            <w:tcW w:type="dxa" w:w="785"/>
+          </w:tcPr>
+          <w:p>
+            <w:r>
+              <w:t>190</w:t>
+            </w:r>
+          </w:p>
+        </w:tc>
+        <w:tc>
+          <w:tcPr>
+            <w:tcW w:type="dxa" w:w="785"/>
+          </w:tcPr>
+          <w:p>
+            <w:r>
+              <w:t>268</w:t>
+            </w:r>
+          </w:p>
+        </w:tc>
+        <w:tc>
+          <w:tcPr>
+            <w:tcW w:type="dxa" w:w="785"/>
+          </w:tcPr>
+          <w:p>
+            <w:r>
+              <w:t>364</w:t>
+            </w:r>
+          </w:p>
+        </w:tc>
+        <w:tc>
+          <w:tcPr>
+            <w:tcW w:type="dxa" w:w="785"/>
+          </w:tcPr>
+          <w:p>
+            <w:r>
+              <w:t>488</w:t>
+            </w:r>
+          </w:p>
+        </w:tc>
+        <w:tc>
+          <w:tcPr>
+            <w:tcW w:type="dxa" w:w="785"/>
+          </w:tcPr>
+          <w:p>
+            <w:r>
+              <w:t>41.5%</w:t>
             </w:r>
           </w:p>
         </w:tc>
@@ -226,17 +735,1061 @@
       <w:tr>
         <w:tc>
           <w:tcPr>
-            <w:tcW w:type="dxa" w:w="4320"/>
+            <w:tcW w:type="dxa" w:w="785"/>
+          </w:tcPr>
+          <w:p>
+            <w:r/>
+          </w:p>
+        </w:tc>
+        <w:tc>
+          <w:tcPr>
+            <w:tcW w:type="dxa" w:w="785"/>
           </w:tcPr>
           <w:p>
             <w:r>
-              <w:t>국내 AI 시장 연평균 성장률 (2021-2026)</w:t>
+              <w:t>헬스케어</w:t>
             </w:r>
           </w:p>
         </w:tc>
         <w:tc>
           <w:tcPr>
-            <w:tcW w:type="dxa" w:w="4320"/>
+            <w:tcW w:type="dxa" w:w="785"/>
+          </w:tcPr>
+          <w:p>
+            <w:r>
+              <w:t>40</w:t>
+            </w:r>
+          </w:p>
+        </w:tc>
+        <w:tc>
+          <w:tcPr>
+            <w:tcW w:type="dxa" w:w="785"/>
+          </w:tcPr>
+          <w:p>
+            <w:r>
+              <w:t>53</w:t>
+            </w:r>
+          </w:p>
+        </w:tc>
+        <w:tc>
+          <w:tcPr>
+            <w:tcW w:type="dxa" w:w="785"/>
+          </w:tcPr>
+          <w:p>
+            <w:r>
+              <w:t>82</w:t>
+            </w:r>
+          </w:p>
+        </w:tc>
+        <w:tc>
+          <w:tcPr>
+            <w:tcW w:type="dxa" w:w="785"/>
+          </w:tcPr>
+          <w:p>
+            <w:r>
+              <w:t>125</w:t>
+            </w:r>
+          </w:p>
+        </w:tc>
+        <w:tc>
+          <w:tcPr>
+            <w:tcW w:type="dxa" w:w="785"/>
+          </w:tcPr>
+          <w:p>
+            <w:r>
+              <w:t>182</w:t>
+            </w:r>
+          </w:p>
+        </w:tc>
+        <w:tc>
+          <w:tcPr>
+            <w:tcW w:type="dxa" w:w="785"/>
+          </w:tcPr>
+          <w:p>
+            <w:r>
+              <w:t>257</w:t>
+            </w:r>
+          </w:p>
+        </w:tc>
+        <w:tc>
+          <w:tcPr>
+            <w:tcW w:type="dxa" w:w="785"/>
+          </w:tcPr>
+          <w:p>
+            <w:r>
+              <w:t>350</w:t>
+            </w:r>
+          </w:p>
+        </w:tc>
+        <w:tc>
+          <w:tcPr>
+            <w:tcW w:type="dxa" w:w="785"/>
+          </w:tcPr>
+          <w:p>
+            <w:r>
+              <w:t>475</w:t>
+            </w:r>
+          </w:p>
+        </w:tc>
+        <w:tc>
+          <w:tcPr>
+            <w:tcW w:type="dxa" w:w="785"/>
+          </w:tcPr>
+          <w:p>
+            <w:r>
+              <w:t>42.1%</w:t>
+            </w:r>
+          </w:p>
+        </w:tc>
+      </w:tr>
+      <w:tr>
+        <w:tc>
+          <w:tcPr>
+            <w:tcW w:type="dxa" w:w="785"/>
+          </w:tcPr>
+          <w:p>
+            <w:r/>
+          </w:p>
+        </w:tc>
+        <w:tc>
+          <w:tcPr>
+            <w:tcW w:type="dxa" w:w="785"/>
+          </w:tcPr>
+          <w:p>
+            <w:r>
+              <w:t>운수 및 물류</w:t>
+            </w:r>
+          </w:p>
+        </w:tc>
+        <w:tc>
+          <w:tcPr>
+            <w:tcW w:type="dxa" w:w="785"/>
+          </w:tcPr>
+          <w:p>
+            <w:r>
+              <w:t>24</w:t>
+            </w:r>
+          </w:p>
+        </w:tc>
+        <w:tc>
+          <w:tcPr>
+            <w:tcW w:type="dxa" w:w="785"/>
+          </w:tcPr>
+          <w:p>
+            <w:r>
+              <w:t>32</w:t>
+            </w:r>
+          </w:p>
+        </w:tc>
+        <w:tc>
+          <w:tcPr>
+            <w:tcW w:type="dxa" w:w="785"/>
+          </w:tcPr>
+          <w:p>
+            <w:r>
+              <w:t>50</w:t>
+            </w:r>
+          </w:p>
+        </w:tc>
+        <w:tc>
+          <w:tcPr>
+            <w:tcW w:type="dxa" w:w="785"/>
+          </w:tcPr>
+          <w:p>
+            <w:r>
+              <w:t>76</w:t>
+            </w:r>
+          </w:p>
+        </w:tc>
+        <w:tc>
+          <w:tcPr>
+            <w:tcW w:type="dxa" w:w="785"/>
+          </w:tcPr>
+          <w:p>
+            <w:r>
+              <w:t>110</w:t>
+            </w:r>
+          </w:p>
+        </w:tc>
+        <w:tc>
+          <w:tcPr>
+            <w:tcW w:type="dxa" w:w="785"/>
+          </w:tcPr>
+          <w:p>
+            <w:r>
+              <w:t>155</w:t>
+            </w:r>
+          </w:p>
+        </w:tc>
+        <w:tc>
+          <w:tcPr>
+            <w:tcW w:type="dxa" w:w="785"/>
+          </w:tcPr>
+          <w:p>
+            <w:r>
+              <w:t>210</w:t>
+            </w:r>
+          </w:p>
+        </w:tc>
+        <w:tc>
+          <w:tcPr>
+            <w:tcW w:type="dxa" w:w="785"/>
+          </w:tcPr>
+          <w:p>
+            <w:r>
+              <w:t>282</w:t>
+            </w:r>
+          </w:p>
+        </w:tc>
+        <w:tc>
+          <w:tcPr>
+            <w:tcW w:type="dxa" w:w="785"/>
+          </w:tcPr>
+          <w:p>
+            <w:r>
+              <w:t>41.3%</w:t>
+            </w:r>
+          </w:p>
+        </w:tc>
+      </w:tr>
+      <w:tr>
+        <w:tc>
+          <w:tcPr>
+            <w:tcW w:type="dxa" w:w="785"/>
+          </w:tcPr>
+          <w:p>
+            <w:r/>
+          </w:p>
+        </w:tc>
+        <w:tc>
+          <w:tcPr>
+            <w:tcW w:type="dxa" w:w="785"/>
+          </w:tcPr>
+          <w:p>
+            <w:r>
+              <w:t>국방 및 공공</w:t>
+            </w:r>
+          </w:p>
+        </w:tc>
+        <w:tc>
+          <w:tcPr>
+            <w:tcW w:type="dxa" w:w="785"/>
+          </w:tcPr>
+          <w:p>
+            <w:r>
+              <w:t>30</w:t>
+            </w:r>
+          </w:p>
+        </w:tc>
+        <w:tc>
+          <w:tcPr>
+            <w:tcW w:type="dxa" w:w="785"/>
+          </w:tcPr>
+          <w:p>
+            <w:r>
+              <w:t>39</w:t>
+            </w:r>
+          </w:p>
+        </w:tc>
+        <w:tc>
+          <w:tcPr>
+            <w:tcW w:type="dxa" w:w="785"/>
+          </w:tcPr>
+          <w:p>
+            <w:r>
+              <w:t>59</w:t>
+            </w:r>
+          </w:p>
+        </w:tc>
+        <w:tc>
+          <w:tcPr>
+            <w:tcW w:type="dxa" w:w="785"/>
+          </w:tcPr>
+          <w:p>
+            <w:r>
+              <w:t>87</w:t>
+            </w:r>
+          </w:p>
+        </w:tc>
+        <w:tc>
+          <w:tcPr>
+            <w:tcW w:type="dxa" w:w="785"/>
+          </w:tcPr>
+          <w:p>
+            <w:r>
+              <w:t>124</w:t>
+            </w:r>
+          </w:p>
+        </w:tc>
+        <w:tc>
+          <w:tcPr>
+            <w:tcW w:type="dxa" w:w="785"/>
+          </w:tcPr>
+          <w:p>
+            <w:r>
+              <w:t>170</w:t>
+            </w:r>
+          </w:p>
+        </w:tc>
+        <w:tc>
+          <w:tcPr>
+            <w:tcW w:type="dxa" w:w="785"/>
+          </w:tcPr>
+          <w:p>
+            <w:r>
+              <w:t>225</w:t>
+            </w:r>
+          </w:p>
+        </w:tc>
+        <w:tc>
+          <w:tcPr>
+            <w:tcW w:type="dxa" w:w="785"/>
+          </w:tcPr>
+          <w:p>
+            <w:r>
+              <w:t>294</w:t>
+            </w:r>
+          </w:p>
+        </w:tc>
+        <w:tc>
+          <w:tcPr>
+            <w:tcW w:type="dxa" w:w="785"/>
+          </w:tcPr>
+          <w:p>
+            <w:r>
+              <w:t>37.9%</w:t>
+            </w:r>
+          </w:p>
+        </w:tc>
+      </w:tr>
+      <w:tr>
+        <w:tc>
+          <w:tcPr>
+            <w:tcW w:type="dxa" w:w="785"/>
+          </w:tcPr>
+          <w:p>
+            <w:r/>
+          </w:p>
+        </w:tc>
+        <w:tc>
+          <w:tcPr>
+            <w:tcW w:type="dxa" w:w="785"/>
+          </w:tcPr>
+          <w:p>
+            <w:r>
+              <w:t>제조</w:t>
+            </w:r>
+          </w:p>
+        </w:tc>
+        <w:tc>
+          <w:tcPr>
+            <w:tcW w:type="dxa" w:w="785"/>
+          </w:tcPr>
+          <w:p>
+            <w:r>
+              <w:t>22</w:t>
+            </w:r>
+          </w:p>
+        </w:tc>
+        <w:tc>
+          <w:tcPr>
+            <w:tcW w:type="dxa" w:w="785"/>
+          </w:tcPr>
+          <w:p>
+            <w:r>
+              <w:t>29</w:t>
+            </w:r>
+          </w:p>
+        </w:tc>
+        <w:tc>
+          <w:tcPr>
+            <w:tcW w:type="dxa" w:w="785"/>
+          </w:tcPr>
+          <w:p>
+            <w:r>
+              <w:t>45</w:t>
+            </w:r>
+          </w:p>
+        </w:tc>
+        <w:tc>
+          <w:tcPr>
+            <w:tcW w:type="dxa" w:w="785"/>
+          </w:tcPr>
+          <w:p>
+            <w:r>
+              <w:t>68</w:t>
+            </w:r>
+          </w:p>
+        </w:tc>
+        <w:tc>
+          <w:tcPr>
+            <w:tcW w:type="dxa" w:w="785"/>
+          </w:tcPr>
+          <w:p>
+            <w:r>
+              <w:t>100</w:t>
+            </w:r>
+          </w:p>
+        </w:tc>
+        <w:tc>
+          <w:tcPr>
+            <w:tcW w:type="dxa" w:w="785"/>
+          </w:tcPr>
+          <w:p>
+            <w:r>
+              <w:t>140</w:t>
+            </w:r>
+          </w:p>
+        </w:tc>
+        <w:tc>
+          <w:tcPr>
+            <w:tcW w:type="dxa" w:w="785"/>
+          </w:tcPr>
+          <w:p>
+            <w:r>
+              <w:t>190</w:t>
+            </w:r>
+          </w:p>
+        </w:tc>
+        <w:tc>
+          <w:tcPr>
+            <w:tcW w:type="dxa" w:w="785"/>
+          </w:tcPr>
+          <w:p>
+            <w:r>
+              <w:t>254</w:t>
+            </w:r>
+          </w:p>
+        </w:tc>
+        <w:tc>
+          <w:tcPr>
+            <w:tcW w:type="dxa" w:w="785"/>
+          </w:tcPr>
+          <w:p>
+            <w:r>
+              <w:t>41.4%</w:t>
+            </w:r>
+          </w:p>
+        </w:tc>
+      </w:tr>
+      <w:tr>
+        <w:tc>
+          <w:tcPr>
+            <w:tcW w:type="dxa" w:w="785"/>
+          </w:tcPr>
+          <w:p>
+            <w:r/>
+          </w:p>
+        </w:tc>
+        <w:tc>
+          <w:tcPr>
+            <w:tcW w:type="dxa" w:w="785"/>
+          </w:tcPr>
+          <w:p>
+            <w:r>
+              <w:t>에너지</w:t>
+            </w:r>
+          </w:p>
+        </w:tc>
+        <w:tc>
+          <w:tcPr>
+            <w:tcW w:type="dxa" w:w="785"/>
+          </w:tcPr>
+          <w:p>
+            <w:r>
+              <w:t>19</w:t>
+            </w:r>
+          </w:p>
+        </w:tc>
+        <w:tc>
+          <w:tcPr>
+            <w:tcW w:type="dxa" w:w="785"/>
+          </w:tcPr>
+          <w:p>
+            <w:r>
+              <w:t>25</w:t>
+            </w:r>
+          </w:p>
+        </w:tc>
+        <w:tc>
+          <w:tcPr>
+            <w:tcW w:type="dxa" w:w="785"/>
+          </w:tcPr>
+          <w:p>
+            <w:r>
+              <w:t>38</w:t>
+            </w:r>
+          </w:p>
+        </w:tc>
+        <w:tc>
+          <w:tcPr>
+            <w:tcW w:type="dxa" w:w="785"/>
+          </w:tcPr>
+          <w:p>
+            <w:r>
+              <w:t>57</w:t>
+            </w:r>
+          </w:p>
+        </w:tc>
+        <w:tc>
+          <w:tcPr>
+            <w:tcW w:type="dxa" w:w="785"/>
+          </w:tcPr>
+          <w:p>
+            <w:r>
+              <w:t>82</w:t>
+            </w:r>
+          </w:p>
+        </w:tc>
+        <w:tc>
+          <w:tcPr>
+            <w:tcW w:type="dxa" w:w="785"/>
+          </w:tcPr>
+          <w:p>
+            <w:r>
+              <w:t>115</w:t>
+            </w:r>
+          </w:p>
+        </w:tc>
+        <w:tc>
+          <w:tcPr>
+            <w:tcW w:type="dxa" w:w="785"/>
+          </w:tcPr>
+          <w:p>
+            <w:r>
+              <w:t>154</w:t>
+            </w:r>
+          </w:p>
+        </w:tc>
+        <w:tc>
+          <w:tcPr>
+            <w:tcW w:type="dxa" w:w="785"/>
+          </w:tcPr>
+          <w:p>
+            <w:r>
+              <w:t>204</w:t>
+            </w:r>
+          </w:p>
+        </w:tc>
+        <w:tc>
+          <w:tcPr>
+            <w:tcW w:type="dxa" w:w="785"/>
+          </w:tcPr>
+          <w:p>
+            <w:r>
+              <w:t>39.9%</w:t>
+            </w:r>
+          </w:p>
+        </w:tc>
+      </w:tr>
+      <w:tr>
+        <w:tc>
+          <w:tcPr>
+            <w:tcW w:type="dxa" w:w="785"/>
+          </w:tcPr>
+          <w:p>
+            <w:r/>
+          </w:p>
+        </w:tc>
+        <w:tc>
+          <w:tcPr>
+            <w:tcW w:type="dxa" w:w="785"/>
+          </w:tcPr>
+          <w:p>
+            <w:r>
+              <w:t>그 외</w:t>
+            </w:r>
+          </w:p>
+        </w:tc>
+        <w:tc>
+          <w:tcPr>
+            <w:tcW w:type="dxa" w:w="785"/>
+          </w:tcPr>
+          <w:p>
+            <w:r>
+              <w:t>7</w:t>
+            </w:r>
+          </w:p>
+        </w:tc>
+        <w:tc>
+          <w:tcPr>
+            <w:tcW w:type="dxa" w:w="785"/>
+          </w:tcPr>
+          <w:p>
+            <w:r>
+              <w:t>8</w:t>
+            </w:r>
+          </w:p>
+        </w:tc>
+        <w:tc>
+          <w:tcPr>
+            <w:tcW w:type="dxa" w:w="785"/>
+          </w:tcPr>
+          <w:p>
+            <w:r>
+              <w:t>12</w:t>
+            </w:r>
+          </w:p>
+        </w:tc>
+        <w:tc>
+          <w:tcPr>
+            <w:tcW w:type="dxa" w:w="785"/>
+          </w:tcPr>
+          <w:p>
+            <w:r>
+              <w:t>17</w:t>
+            </w:r>
+          </w:p>
+        </w:tc>
+        <w:tc>
+          <w:tcPr>
+            <w:tcW w:type="dxa" w:w="785"/>
+          </w:tcPr>
+          <w:p>
+            <w:r>
+              <w:t>23</w:t>
+            </w:r>
+          </w:p>
+        </w:tc>
+        <w:tc>
+          <w:tcPr>
+            <w:tcW w:type="dxa" w:w="785"/>
+          </w:tcPr>
+          <w:p>
+            <w:r>
+              <w:t>29</w:t>
+            </w:r>
+          </w:p>
+        </w:tc>
+        <w:tc>
+          <w:tcPr>
+            <w:tcW w:type="dxa" w:w="785"/>
+          </w:tcPr>
+          <w:p>
+            <w:r>
+              <w:t>36</w:t>
+            </w:r>
+          </w:p>
+        </w:tc>
+        <w:tc>
+          <w:tcPr>
+            <w:tcW w:type="dxa" w:w="785"/>
+          </w:tcPr>
+          <w:p>
+            <w:r>
+              <w:t>42</w:t>
+            </w:r>
+          </w:p>
+        </w:tc>
+        <w:tc>
+          <w:tcPr>
+            <w:tcW w:type="dxa" w:w="785"/>
+          </w:tcPr>
+          <w:p>
+            <w:r>
+              <w:t>28.5%</w:t>
+            </w:r>
+          </w:p>
+        </w:tc>
+      </w:tr>
+      <w:tr>
+        <w:tc>
+          <w:tcPr>
+            <w:tcW w:type="dxa" w:w="785"/>
+          </w:tcPr>
+          <w:p>
+            <w:r>
+              <w:t>성장률(YoY)</w:t>
+            </w:r>
+          </w:p>
+        </w:tc>
+        <w:tc>
+          <w:tcPr>
+            <w:tcW w:type="dxa" w:w="785"/>
+          </w:tcPr>
+          <w:p>
+            <w:r/>
+          </w:p>
+        </w:tc>
+        <w:tc>
+          <w:tcPr>
+            <w:tcW w:type="dxa" w:w="785"/>
+          </w:tcPr>
+          <w:p>
+            <w:r>
+              <w:t>-</w:t>
+            </w:r>
+          </w:p>
+        </w:tc>
+        <w:tc>
+          <w:tcPr>
+            <w:tcW w:type="dxa" w:w="785"/>
+          </w:tcPr>
+          <w:p>
+            <w:r>
+              <w:t>30.4%</w:t>
+            </w:r>
+          </w:p>
+        </w:tc>
+        <w:tc>
+          <w:tcPr>
+            <w:tcW w:type="dxa" w:w="785"/>
+          </w:tcPr>
+          <w:p>
+            <w:r>
+              <w:t>54.1%</w:t>
+            </w:r>
+          </w:p>
+        </w:tc>
+        <w:tc>
+          <w:tcPr>
+            <w:tcW w:type="dxa" w:w="785"/>
+          </w:tcPr>
+          <w:p>
+            <w:r>
+              <w:t>49.6%</w:t>
+            </w:r>
+          </w:p>
+        </w:tc>
+        <w:tc>
+          <w:tcPr>
+            <w:tcW w:type="dxa" w:w="785"/>
+          </w:tcPr>
+          <w:p>
+            <w:r>
+              <w:t>44.1%</w:t>
+            </w:r>
+          </w:p>
+        </w:tc>
+        <w:tc>
+          <w:tcPr>
+            <w:tcW w:type="dxa" w:w="785"/>
+          </w:tcPr>
+          <w:p>
+            <w:r>
+              <w:t>39.1%</w:t>
+            </w:r>
+          </w:p>
+        </w:tc>
+        <w:tc>
+          <w:tcPr>
+            <w:tcW w:type="dxa" w:w="785"/>
+          </w:tcPr>
+          <w:p>
+            <w:r>
+              <w:t>34.2%</w:t>
+            </w:r>
+          </w:p>
+        </w:tc>
+        <w:tc>
+          <w:tcPr>
+            <w:tcW w:type="dxa" w:w="785"/>
+          </w:tcPr>
+          <w:p>
+            <w:r>
+              <w:t>32.4%</w:t>
+            </w:r>
+          </w:p>
+        </w:tc>
+        <w:tc>
+          <w:tcPr>
+            <w:tcW w:type="dxa" w:w="785"/>
+          </w:tcPr>
+          <w:p>
+            <w:r>
+              <w:t>-</w:t>
+            </w:r>
+          </w:p>
+        </w:tc>
+      </w:tr>
+    </w:tbl>
+    <w:p/>
+    <w:tbl>
+      <w:tblPr>
+        <w:tblStyle w:val="TableGrid"/>
+        <w:tblW w:type="auto" w:w="0"/>
+        <w:tblLook w:firstColumn="1" w:firstRow="1" w:lastColumn="0" w:lastRow="0" w:noHBand="0" w:noVBand="1" w:val="04A0"/>
+      </w:tblPr>
+      <w:tblGrid>
+        <w:gridCol w:w="720"/>
+        <w:gridCol w:w="720"/>
+        <w:gridCol w:w="720"/>
+        <w:gridCol w:w="720"/>
+        <w:gridCol w:w="720"/>
+        <w:gridCol w:w="720"/>
+        <w:gridCol w:w="720"/>
+        <w:gridCol w:w="720"/>
+        <w:gridCol w:w="720"/>
+        <w:gridCol w:w="720"/>
+        <w:gridCol w:w="720"/>
+        <w:gridCol w:w="720"/>
+      </w:tblGrid>
+      <w:tr>
+        <w:tc>
+          <w:tcPr>
+            <w:tcW w:type="dxa" w:w="720"/>
+          </w:tcPr>
+          <w:p>
+            <w:r>
+              <w:rPr>
+                <w:b/>
+              </w:rPr>
+              <w:t>구분</w:t>
+            </w:r>
+          </w:p>
+        </w:tc>
+        <w:tc>
+          <w:tcPr>
+            <w:tcW w:type="dxa" w:w="720"/>
+          </w:tcPr>
+          <w:p>
+            <w:r>
+              <w:rPr>
+                <w:b/>
+              </w:rPr>
+            </w:r>
+          </w:p>
+        </w:tc>
+        <w:tc>
+          <w:tcPr>
+            <w:tcW w:type="dxa" w:w="720"/>
+          </w:tcPr>
+          <w:p>
+            <w:r>
+              <w:rPr>
+                <w:b/>
+              </w:rPr>
+            </w:r>
+          </w:p>
+        </w:tc>
+        <w:tc>
+          <w:tcPr>
+            <w:tcW w:type="dxa" w:w="720"/>
+          </w:tcPr>
+          <w:p>
+            <w:r>
+              <w:rPr>
+                <w:b/>
+              </w:rPr>
+              <w:t>2019년</w:t>
+            </w:r>
+          </w:p>
+        </w:tc>
+        <w:tc>
+          <w:tcPr>
+            <w:tcW w:type="dxa" w:w="720"/>
+          </w:tcPr>
+          <w:p>
+            <w:r>
+              <w:rPr>
+                <w:b/>
+              </w:rPr>
+              <w:t>2020년</w:t>
+            </w:r>
+          </w:p>
+        </w:tc>
+        <w:tc>
+          <w:tcPr>
+            <w:tcW w:type="dxa" w:w="720"/>
+          </w:tcPr>
+          <w:p>
+            <w:r>
+              <w:rPr>
+                <w:b/>
+              </w:rPr>
+              <w:t>2021년(p)</w:t>
+            </w:r>
+          </w:p>
+        </w:tc>
+        <w:tc>
+          <w:tcPr>
+            <w:tcW w:type="dxa" w:w="720"/>
+          </w:tcPr>
+          <w:p>
+            <w:r>
+              <w:rPr>
+                <w:b/>
+              </w:rPr>
+              <w:t>2022년(E)</w:t>
+            </w:r>
+          </w:p>
+        </w:tc>
+        <w:tc>
+          <w:tcPr>
+            <w:tcW w:type="dxa" w:w="720"/>
+          </w:tcPr>
+          <w:p>
+            <w:r>
+              <w:rPr>
+                <w:b/>
+              </w:rPr>
+              <w:t>2023년(E)</w:t>
+            </w:r>
+          </w:p>
+        </w:tc>
+        <w:tc>
+          <w:tcPr>
+            <w:tcW w:type="dxa" w:w="720"/>
+          </w:tcPr>
+          <w:p>
+            <w:r>
+              <w:rPr>
+                <w:b/>
+              </w:rPr>
+              <w:t>2024년(E)</w:t>
+            </w:r>
+          </w:p>
+        </w:tc>
+        <w:tc>
+          <w:tcPr>
+            <w:tcW w:type="dxa" w:w="720"/>
+          </w:tcPr>
+          <w:p>
+            <w:r>
+              <w:rPr>
+                <w:b/>
+              </w:rPr>
+              <w:t>2025년(E)</w:t>
+            </w:r>
+          </w:p>
+        </w:tc>
+        <w:tc>
+          <w:tcPr>
+            <w:tcW w:type="dxa" w:w="720"/>
+          </w:tcPr>
+          <w:p>
+            <w:r>
+              <w:rPr>
+                <w:b/>
+              </w:rPr>
+              <w:t>2026년(E)</w:t>
+            </w:r>
+          </w:p>
+        </w:tc>
+        <w:tc>
+          <w:tcPr>
+            <w:tcW w:type="dxa" w:w="720"/>
+          </w:tcPr>
+          <w:p>
+            <w:r>
+              <w:rPr>
+                <w:b/>
+              </w:rPr>
+              <w:t>CAGR(%) (‘21~’26)</w:t>
+            </w:r>
+          </w:p>
+        </w:tc>
+      </w:tr>
+      <w:tr>
+        <w:tc>
+          <w:tcPr>
+            <w:tcW w:type="dxa" w:w="720"/>
+          </w:tcPr>
+          <w:p>
+            <w:r>
+              <w:t>시장규모</w:t>
+            </w:r>
+          </w:p>
+        </w:tc>
+        <w:tc>
+          <w:tcPr>
+            <w:tcW w:type="dxa" w:w="720"/>
+          </w:tcPr>
+          <w:p>
+            <w:r/>
+          </w:p>
+        </w:tc>
+        <w:tc>
+          <w:tcPr>
+            <w:tcW w:type="dxa" w:w="720"/>
+          </w:tcPr>
+          <w:p>
+            <w:r/>
+          </w:p>
+        </w:tc>
+        <w:tc>
+          <w:tcPr>
+            <w:tcW w:type="dxa" w:w="720"/>
+          </w:tcPr>
+          <w:p>
+            <w:r>
+              <w:t>1.5</w:t>
+            </w:r>
+          </w:p>
+        </w:tc>
+        <w:tc>
+          <w:tcPr>
+            <w:tcW w:type="dxa" w:w="720"/>
+          </w:tcPr>
+          <w:p>
+            <w:r>
+              <w:t>2.1</w:t>
+            </w:r>
+          </w:p>
+        </w:tc>
+        <w:tc>
+          <w:tcPr>
+            <w:tcW w:type="dxa" w:w="720"/>
+          </w:tcPr>
+          <w:p>
+            <w:r>
+              <w:t>3.2</w:t>
+            </w:r>
+          </w:p>
+        </w:tc>
+        <w:tc>
+          <w:tcPr>
+            <w:tcW w:type="dxa" w:w="720"/>
+          </w:tcPr>
+          <w:p>
+            <w:r>
+              <w:t>4.5</w:t>
+            </w:r>
+          </w:p>
+        </w:tc>
+        <w:tc>
+          <w:tcPr>
+            <w:tcW w:type="dxa" w:w="720"/>
+          </w:tcPr>
+          <w:p>
+            <w:r>
+              <w:t>6.3</w:t>
+            </w:r>
+          </w:p>
+        </w:tc>
+        <w:tc>
+          <w:tcPr>
+            <w:tcW w:type="dxa" w:w="720"/>
+          </w:tcPr>
+          <w:p>
+            <w:r>
+              <w:t>8.8</w:t>
+            </w:r>
+          </w:p>
+        </w:tc>
+        <w:tc>
+          <w:tcPr>
+            <w:tcW w:type="dxa" w:w="720"/>
+          </w:tcPr>
+          <w:p>
+            <w:r>
+              <w:t>12.4</w:t>
+            </w:r>
+          </w:p>
+        </w:tc>
+        <w:tc>
+          <w:tcPr>
+            <w:tcW w:type="dxa" w:w="720"/>
+          </w:tcPr>
+          <w:p>
+            <w:r>
+              <w:t>17.4</w:t>
+            </w:r>
+          </w:p>
+        </w:tc>
+        <w:tc>
+          <w:tcPr>
+            <w:tcW w:type="dxa" w:w="720"/>
           </w:tcPr>
           <w:p>
             <w:r>
@@ -248,61 +1801,113 @@
       <w:tr>
         <w:tc>
           <w:tcPr>
-            <w:tcW w:type="dxa" w:w="4320"/>
+            <w:tcW w:type="dxa" w:w="720"/>
+          </w:tcPr>
+          <w:p>
+            <w:r/>
+          </w:p>
+        </w:tc>
+        <w:tc>
+          <w:tcPr>
+            <w:tcW w:type="dxa" w:w="720"/>
           </w:tcPr>
           <w:p>
             <w:r>
-              <w:t>국내 금융 AI 시장 규모 (2021년)</w:t>
+              <w:t>금융</w:t>
             </w:r>
           </w:p>
         </w:tc>
         <w:tc>
           <w:tcPr>
-            <w:tcW w:type="dxa" w:w="4320"/>
+            <w:tcW w:type="dxa" w:w="720"/>
+          </w:tcPr>
+          <w:p>
+            <w:r/>
+          </w:p>
+        </w:tc>
+        <w:tc>
+          <w:tcPr>
+            <w:tcW w:type="dxa" w:w="720"/>
           </w:tcPr>
           <w:p>
             <w:r>
-              <w:t>6천억 원</w:t>
-            </w:r>
-          </w:p>
-        </w:tc>
-      </w:tr>
-      <w:tr>
-        <w:tc>
-          <w:tcPr>
-            <w:tcW w:type="dxa" w:w="4320"/>
-          </w:tcPr>
-          <w:p>
-            <w:r>
-              <w:t>국내 금융 AI 시장 규모 전망 (2026년)</w:t>
+              <w:t>0.3</w:t>
             </w:r>
           </w:p>
         </w:tc>
         <w:tc>
           <w:tcPr>
-            <w:tcW w:type="dxa" w:w="4320"/>
+            <w:tcW w:type="dxa" w:w="720"/>
           </w:tcPr>
           <w:p>
             <w:r>
-              <w:t>3.2조 원</w:t>
-            </w:r>
-          </w:p>
-        </w:tc>
-      </w:tr>
-      <w:tr>
-        <w:tc>
-          <w:tcPr>
-            <w:tcW w:type="dxa" w:w="4320"/>
-          </w:tcPr>
-          <w:p>
-            <w:r>
-              <w:t>국내 금융 AI 시장 연평균 성장률 (2021-2026)</w:t>
+              <w:t>0.4</w:t>
             </w:r>
           </w:p>
         </w:tc>
         <w:tc>
           <w:tcPr>
-            <w:tcW w:type="dxa" w:w="4320"/>
+            <w:tcW w:type="dxa" w:w="720"/>
+          </w:tcPr>
+          <w:p>
+            <w:r>
+              <w:t>0.6</w:t>
+            </w:r>
+          </w:p>
+        </w:tc>
+        <w:tc>
+          <w:tcPr>
+            <w:tcW w:type="dxa" w:w="720"/>
+          </w:tcPr>
+          <w:p>
+            <w:r>
+              <w:t>0.9</w:t>
+            </w:r>
+          </w:p>
+        </w:tc>
+        <w:tc>
+          <w:tcPr>
+            <w:tcW w:type="dxa" w:w="720"/>
+          </w:tcPr>
+          <w:p>
+            <w:r>
+              <w:t>1.2</w:t>
+            </w:r>
+          </w:p>
+        </w:tc>
+        <w:tc>
+          <w:tcPr>
+            <w:tcW w:type="dxa" w:w="720"/>
+          </w:tcPr>
+          <w:p>
+            <w:r>
+              <w:t>1.7</w:t>
+            </w:r>
+          </w:p>
+        </w:tc>
+        <w:tc>
+          <w:tcPr>
+            <w:tcW w:type="dxa" w:w="720"/>
+          </w:tcPr>
+          <w:p>
+            <w:r>
+              <w:t>2.3</w:t>
+            </w:r>
+          </w:p>
+        </w:tc>
+        <w:tc>
+          <w:tcPr>
+            <w:tcW w:type="dxa" w:w="720"/>
+          </w:tcPr>
+          <w:p>
+            <w:r>
+              <w:t>3.2</w:t>
+            </w:r>
+          </w:p>
+        </w:tc>
+        <w:tc>
+          <w:tcPr>
+            <w:tcW w:type="dxa" w:w="720"/>
           </w:tcPr>
           <w:p>
             <w:r>
@@ -314,21 +1919,589 @@
       <w:tr>
         <w:tc>
           <w:tcPr>
-            <w:tcW w:type="dxa" w:w="4320"/>
+            <w:tcW w:type="dxa" w:w="720"/>
+          </w:tcPr>
+          <w:p>
+            <w:r/>
+          </w:p>
+        </w:tc>
+        <w:tc>
+          <w:tcPr>
+            <w:tcW w:type="dxa" w:w="720"/>
+          </w:tcPr>
+          <w:p>
+            <w:r/>
+          </w:p>
+        </w:tc>
+        <w:tc>
+          <w:tcPr>
+            <w:tcW w:type="dxa" w:w="720"/>
           </w:tcPr>
           <w:p>
             <w:r>
-              <w:t>보고서 발행 연도</w:t>
+              <w:t>신용평가</w:t>
             </w:r>
           </w:p>
         </w:tc>
         <w:tc>
           <w:tcPr>
-            <w:tcW w:type="dxa" w:w="4320"/>
+            <w:tcW w:type="dxa" w:w="720"/>
           </w:tcPr>
           <w:p>
             <w:r>
-              <w:t>2022년</w:t>
+              <w:t>0.10</w:t>
+            </w:r>
+          </w:p>
+        </w:tc>
+        <w:tc>
+          <w:tcPr>
+            <w:tcW w:type="dxa" w:w="720"/>
+          </w:tcPr>
+          <w:p>
+            <w:r>
+              <w:t>0.14</w:t>
+            </w:r>
+          </w:p>
+        </w:tc>
+        <w:tc>
+          <w:tcPr>
+            <w:tcW w:type="dxa" w:w="720"/>
+          </w:tcPr>
+          <w:p>
+            <w:r>
+              <w:t>0.22</w:t>
+            </w:r>
+          </w:p>
+        </w:tc>
+        <w:tc>
+          <w:tcPr>
+            <w:tcW w:type="dxa" w:w="720"/>
+          </w:tcPr>
+          <w:p>
+            <w:r>
+              <w:t>0.30</w:t>
+            </w:r>
+          </w:p>
+        </w:tc>
+        <w:tc>
+          <w:tcPr>
+            <w:tcW w:type="dxa" w:w="720"/>
+          </w:tcPr>
+          <w:p>
+            <w:r>
+              <w:t>0.42</w:t>
+            </w:r>
+          </w:p>
+        </w:tc>
+        <w:tc>
+          <w:tcPr>
+            <w:tcW w:type="dxa" w:w="720"/>
+          </w:tcPr>
+          <w:p>
+            <w:r>
+              <w:t>0.58</w:t>
+            </w:r>
+          </w:p>
+        </w:tc>
+        <w:tc>
+          <w:tcPr>
+            <w:tcW w:type="dxa" w:w="720"/>
+          </w:tcPr>
+          <w:p>
+            <w:r>
+              <w:t>0.81</w:t>
+            </w:r>
+          </w:p>
+        </w:tc>
+        <w:tc>
+          <w:tcPr>
+            <w:tcW w:type="dxa" w:w="720"/>
+          </w:tcPr>
+          <w:p>
+            <w:r>
+              <w:t>1.11</w:t>
+            </w:r>
+          </w:p>
+        </w:tc>
+        <w:tc>
+          <w:tcPr>
+            <w:tcW w:type="dxa" w:w="720"/>
+          </w:tcPr>
+          <w:p>
+            <w:r>
+              <w:t>38.1%</w:t>
+            </w:r>
+          </w:p>
+        </w:tc>
+      </w:tr>
+      <w:tr>
+        <w:tc>
+          <w:tcPr>
+            <w:tcW w:type="dxa" w:w="720"/>
+          </w:tcPr>
+          <w:p>
+            <w:r/>
+          </w:p>
+        </w:tc>
+        <w:tc>
+          <w:tcPr>
+            <w:tcW w:type="dxa" w:w="720"/>
+          </w:tcPr>
+          <w:p>
+            <w:r/>
+          </w:p>
+        </w:tc>
+        <w:tc>
+          <w:tcPr>
+            <w:tcW w:type="dxa" w:w="720"/>
+          </w:tcPr>
+          <w:p>
+            <w:r>
+              <w:t>고객경험제고</w:t>
+            </w:r>
+          </w:p>
+        </w:tc>
+        <w:tc>
+          <w:tcPr>
+            <w:tcW w:type="dxa" w:w="720"/>
+          </w:tcPr>
+          <w:p>
+            <w:r>
+              <w:t>0.09</w:t>
+            </w:r>
+          </w:p>
+        </w:tc>
+        <w:tc>
+          <w:tcPr>
+            <w:tcW w:type="dxa" w:w="720"/>
+          </w:tcPr>
+          <w:p>
+            <w:r>
+              <w:t>0.12</w:t>
+            </w:r>
+          </w:p>
+        </w:tc>
+        <w:tc>
+          <w:tcPr>
+            <w:tcW w:type="dxa" w:w="720"/>
+          </w:tcPr>
+          <w:p>
+            <w:r>
+              <w:t>0.19</w:t>
+            </w:r>
+          </w:p>
+        </w:tc>
+        <w:tc>
+          <w:tcPr>
+            <w:tcW w:type="dxa" w:w="720"/>
+          </w:tcPr>
+          <w:p>
+            <w:r>
+              <w:t>0.25</w:t>
+            </w:r>
+          </w:p>
+        </w:tc>
+        <w:tc>
+          <w:tcPr>
+            <w:tcW w:type="dxa" w:w="720"/>
+          </w:tcPr>
+          <w:p>
+            <w:r>
+              <w:t>0.35</w:t>
+            </w:r>
+          </w:p>
+        </w:tc>
+        <w:tc>
+          <w:tcPr>
+            <w:tcW w:type="dxa" w:w="720"/>
+          </w:tcPr>
+          <w:p>
+            <w:r>
+              <w:t>0.47</w:t>
+            </w:r>
+          </w:p>
+        </w:tc>
+        <w:tc>
+          <w:tcPr>
+            <w:tcW w:type="dxa" w:w="720"/>
+          </w:tcPr>
+          <w:p>
+            <w:r>
+              <w:t>0.65</w:t>
+            </w:r>
+          </w:p>
+        </w:tc>
+        <w:tc>
+          <w:tcPr>
+            <w:tcW w:type="dxa" w:w="720"/>
+          </w:tcPr>
+          <w:p>
+            <w:r>
+              <w:t>0.89</w:t>
+            </w:r>
+          </w:p>
+        </w:tc>
+        <w:tc>
+          <w:tcPr>
+            <w:tcW w:type="dxa" w:w="720"/>
+          </w:tcPr>
+          <w:p>
+            <w:r>
+              <w:t>36.6%</w:t>
+            </w:r>
+          </w:p>
+        </w:tc>
+      </w:tr>
+      <w:tr>
+        <w:tc>
+          <w:tcPr>
+            <w:tcW w:type="dxa" w:w="720"/>
+          </w:tcPr>
+          <w:p>
+            <w:r/>
+          </w:p>
+        </w:tc>
+        <w:tc>
+          <w:tcPr>
+            <w:tcW w:type="dxa" w:w="720"/>
+          </w:tcPr>
+          <w:p>
+            <w:r/>
+          </w:p>
+        </w:tc>
+        <w:tc>
+          <w:tcPr>
+            <w:tcW w:type="dxa" w:w="720"/>
+          </w:tcPr>
+          <w:p>
+            <w:r>
+              <w:t>로봇자동화</w:t>
+            </w:r>
+          </w:p>
+        </w:tc>
+        <w:tc>
+          <w:tcPr>
+            <w:tcW w:type="dxa" w:w="720"/>
+          </w:tcPr>
+          <w:p>
+            <w:r>
+              <w:t>0.06</w:t>
+            </w:r>
+          </w:p>
+        </w:tc>
+        <w:tc>
+          <w:tcPr>
+            <w:tcW w:type="dxa" w:w="720"/>
+          </w:tcPr>
+          <w:p>
+            <w:r>
+              <w:t>0.08</w:t>
+            </w:r>
+          </w:p>
+        </w:tc>
+        <w:tc>
+          <w:tcPr>
+            <w:tcW w:type="dxa" w:w="720"/>
+          </w:tcPr>
+          <w:p>
+            <w:r>
+              <w:t>0.14</w:t>
+            </w:r>
+          </w:p>
+        </w:tc>
+        <w:tc>
+          <w:tcPr>
+            <w:tcW w:type="dxa" w:w="720"/>
+          </w:tcPr>
+          <w:p>
+            <w:r>
+              <w:t>0.20</w:t>
+            </w:r>
+          </w:p>
+        </w:tc>
+        <w:tc>
+          <w:tcPr>
+            <w:tcW w:type="dxa" w:w="720"/>
+          </w:tcPr>
+          <w:p>
+            <w:r>
+              <w:t>0.28</w:t>
+            </w:r>
+          </w:p>
+        </w:tc>
+        <w:tc>
+          <w:tcPr>
+            <w:tcW w:type="dxa" w:w="720"/>
+          </w:tcPr>
+          <w:p>
+            <w:r>
+              <w:t>0.40</w:t>
+            </w:r>
+          </w:p>
+        </w:tc>
+        <w:tc>
+          <w:tcPr>
+            <w:tcW w:type="dxa" w:w="720"/>
+          </w:tcPr>
+          <w:p>
+            <w:r>
+              <w:t>0.56</w:t>
+            </w:r>
+          </w:p>
+        </w:tc>
+        <w:tc>
+          <w:tcPr>
+            <w:tcW w:type="dxa" w:w="720"/>
+          </w:tcPr>
+          <w:p>
+            <w:r>
+              <w:t>0.79</w:t>
+            </w:r>
+          </w:p>
+        </w:tc>
+        <w:tc>
+          <w:tcPr>
+            <w:tcW w:type="dxa" w:w="720"/>
+          </w:tcPr>
+          <w:p>
+            <w:r>
+              <w:t>41.4%</w:t>
+            </w:r>
+          </w:p>
+        </w:tc>
+      </w:tr>
+      <w:tr>
+        <w:tc>
+          <w:tcPr>
+            <w:tcW w:type="dxa" w:w="720"/>
+          </w:tcPr>
+          <w:p>
+            <w:r/>
+          </w:p>
+        </w:tc>
+        <w:tc>
+          <w:tcPr>
+            <w:tcW w:type="dxa" w:w="720"/>
+          </w:tcPr>
+          <w:p>
+            <w:r/>
+          </w:p>
+        </w:tc>
+        <w:tc>
+          <w:tcPr>
+            <w:tcW w:type="dxa" w:w="720"/>
+          </w:tcPr>
+          <w:p>
+            <w:r>
+              <w:t>그 외</w:t>
+            </w:r>
+          </w:p>
+        </w:tc>
+        <w:tc>
+          <w:tcPr>
+            <w:tcW w:type="dxa" w:w="720"/>
+          </w:tcPr>
+          <w:p>
+            <w:r>
+              <w:t>0.04</w:t>
+            </w:r>
+          </w:p>
+        </w:tc>
+        <w:tc>
+          <w:tcPr>
+            <w:tcW w:type="dxa" w:w="720"/>
+          </w:tcPr>
+          <w:p>
+            <w:r>
+              <w:t>0.05</w:t>
+            </w:r>
+          </w:p>
+        </w:tc>
+        <w:tc>
+          <w:tcPr>
+            <w:tcW w:type="dxa" w:w="720"/>
+          </w:tcPr>
+          <w:p>
+            <w:r>
+              <w:t>0.08</w:t>
+            </w:r>
+          </w:p>
+        </w:tc>
+        <w:tc>
+          <w:tcPr>
+            <w:tcW w:type="dxa" w:w="720"/>
+          </w:tcPr>
+          <w:p>
+            <w:r>
+              <w:t>0.11</w:t>
+            </w:r>
+          </w:p>
+        </w:tc>
+        <w:tc>
+          <w:tcPr>
+            <w:tcW w:type="dxa" w:w="720"/>
+          </w:tcPr>
+          <w:p>
+            <w:r>
+              <w:t>0.15</w:t>
+            </w:r>
+          </w:p>
+        </w:tc>
+        <w:tc>
+          <w:tcPr>
+            <w:tcW w:type="dxa" w:w="720"/>
+          </w:tcPr>
+          <w:p>
+            <w:r>
+              <w:t>0.20</w:t>
+            </w:r>
+          </w:p>
+        </w:tc>
+        <w:tc>
+          <w:tcPr>
+            <w:tcW w:type="dxa" w:w="720"/>
+          </w:tcPr>
+          <w:p>
+            <w:r>
+              <w:t>0.27</w:t>
+            </w:r>
+          </w:p>
+        </w:tc>
+        <w:tc>
+          <w:tcPr>
+            <w:tcW w:type="dxa" w:w="720"/>
+          </w:tcPr>
+          <w:p>
+            <w:r>
+              <w:t>0.37</w:t>
+            </w:r>
+          </w:p>
+        </w:tc>
+        <w:tc>
+          <w:tcPr>
+            <w:tcW w:type="dxa" w:w="720"/>
+          </w:tcPr>
+          <w:p>
+            <w:r>
+              <w:t>36.5%</w:t>
+            </w:r>
+          </w:p>
+        </w:tc>
+      </w:tr>
+      <w:tr>
+        <w:tc>
+          <w:tcPr>
+            <w:tcW w:type="dxa" w:w="720"/>
+          </w:tcPr>
+          <w:p>
+            <w:r>
+              <w:t>성장률(YoY)</w:t>
+            </w:r>
+          </w:p>
+        </w:tc>
+        <w:tc>
+          <w:tcPr>
+            <w:tcW w:type="dxa" w:w="720"/>
+          </w:tcPr>
+          <w:p>
+            <w:r/>
+          </w:p>
+        </w:tc>
+        <w:tc>
+          <w:tcPr>
+            <w:tcW w:type="dxa" w:w="720"/>
+          </w:tcPr>
+          <w:p>
+            <w:r/>
+          </w:p>
+        </w:tc>
+        <w:tc>
+          <w:tcPr>
+            <w:tcW w:type="dxa" w:w="720"/>
+          </w:tcPr>
+          <w:p>
+            <w:r>
+              <w:t>-</w:t>
+            </w:r>
+          </w:p>
+        </w:tc>
+        <w:tc>
+          <w:tcPr>
+            <w:tcW w:type="dxa" w:w="720"/>
+          </w:tcPr>
+          <w:p>
+            <w:r>
+              <w:t>32.2%</w:t>
+            </w:r>
+          </w:p>
+        </w:tc>
+        <w:tc>
+          <w:tcPr>
+            <w:tcW w:type="dxa" w:w="720"/>
+          </w:tcPr>
+          <w:p>
+            <w:r>
+              <w:t>60.7%</w:t>
+            </w:r>
+          </w:p>
+        </w:tc>
+        <w:tc>
+          <w:tcPr>
+            <w:tcW w:type="dxa" w:w="720"/>
+          </w:tcPr>
+          <w:p>
+            <w:r>
+              <w:t>37.5%</w:t>
+            </w:r>
+          </w:p>
+        </w:tc>
+        <w:tc>
+          <w:tcPr>
+            <w:tcW w:type="dxa" w:w="720"/>
+          </w:tcPr>
+          <w:p>
+            <w:r>
+              <w:t>39.1%</w:t>
+            </w:r>
+          </w:p>
+        </w:tc>
+        <w:tc>
+          <w:tcPr>
+            <w:tcW w:type="dxa" w:w="720"/>
+          </w:tcPr>
+          <w:p>
+            <w:r>
+              <w:t>38.5%</w:t>
+            </w:r>
+          </w:p>
+        </w:tc>
+        <w:tc>
+          <w:tcPr>
+            <w:tcW w:type="dxa" w:w="720"/>
+          </w:tcPr>
+          <w:p>
+            <w:r>
+              <w:t>38.4%</w:t>
+            </w:r>
+          </w:p>
+        </w:tc>
+        <w:tc>
+          <w:tcPr>
+            <w:tcW w:type="dxa" w:w="720"/>
+          </w:tcPr>
+          <w:p>
+            <w:r>
+              <w:t>37.5%</w:t>
+            </w:r>
+          </w:p>
+        </w:tc>
+        <w:tc>
+          <w:tcPr>
+            <w:tcW w:type="dxa" w:w="720"/>
+          </w:tcPr>
+          <w:p>
+            <w:r>
+              <w:t>-</w:t>
             </w:r>
           </w:p>
         </w:tc>
@@ -337,101 +2510,151 @@
     <w:p/>
     <w:p>
       <w:pPr>
-        <w:pStyle w:val="Heading1"/>
+        <w:jc w:val="center"/>
       </w:pPr>
       <w:r>
-        <w:t>섹션별 요약</w:t>
+        <w:drawing>
+          <wp:inline xmlns:a="http://schemas.openxmlformats.org/drawingml/2006/main" xmlns:pic="http://schemas.openxmlformats.org/drawingml/2006/picture">
+            <wp:extent cx="5029200" cy="3844310"/>
+            <wp:docPr id="1" name="Picture 1"/>
+            <wp:cNvGraphicFramePr>
+              <a:graphicFrameLocks noChangeAspect="1"/>
+            </wp:cNvGraphicFramePr>
+            <a:graphic>
+              <a:graphicData uri="http://schemas.openxmlformats.org/drawingml/2006/picture">
+                <pic:pic>
+                  <pic:nvPicPr>
+                    <pic:cNvPr id="0" name="imageFile3.png"/>
+                    <pic:cNvPicPr/>
+                  </pic:nvPicPr>
+                  <pic:blipFill>
+                    <a:blip r:embed="rId9"/>
+                    <a:stretch>
+                      <a:fillRect/>
+                    </a:stretch>
+                  </pic:blipFill>
+                  <pic:spPr>
+                    <a:xfrm>
+                      <a:off x="0" y="0"/>
+                      <a:ext cx="5029200" cy="3844310"/>
+                    </a:xfrm>
+                    <a:prstGeom prst="rect"/>
+                  </pic:spPr>
+                </pic:pic>
+              </a:graphicData>
+            </a:graphic>
+          </wp:inline>
+        </w:drawing>
+      </w:r>
+    </w:p>
+    <w:p/>
+    <w:p>
+      <w:pPr>
+        <w:jc w:val="center"/>
+      </w:pPr>
+      <w:r>
+        <w:drawing>
+          <wp:inline xmlns:a="http://schemas.openxmlformats.org/drawingml/2006/main" xmlns:pic="http://schemas.openxmlformats.org/drawingml/2006/picture">
+            <wp:extent cx="5029200" cy="2900820"/>
+            <wp:docPr id="2" name="Picture 2"/>
+            <wp:cNvGraphicFramePr>
+              <a:graphicFrameLocks noChangeAspect="1"/>
+            </wp:cNvGraphicFramePr>
+            <a:graphic>
+              <a:graphicData uri="http://schemas.openxmlformats.org/drawingml/2006/picture">
+                <pic:pic>
+                  <pic:nvPicPr>
+                    <pic:cNvPr id="0" name="imageFile5.png"/>
+                    <pic:cNvPicPr/>
+                  </pic:nvPicPr>
+                  <pic:blipFill>
+                    <a:blip r:embed="rId10"/>
+                    <a:stretch>
+                      <a:fillRect/>
+                    </a:stretch>
+                  </pic:blipFill>
+                  <pic:spPr>
+                    <a:xfrm>
+                      <a:off x="0" y="0"/>
+                      <a:ext cx="5029200" cy="2900820"/>
+                    </a:xfrm>
+                    <a:prstGeom prst="rect"/>
+                  </pic:spPr>
+                </pic:pic>
+              </a:graphicData>
+            </a:graphic>
+          </wp:inline>
+        </w:drawing>
+      </w:r>
+    </w:p>
+    <w:p/>
+    <w:p>
+      <w:pPr>
+        <w:pStyle w:val="Heading2"/>
+      </w:pPr>
+      <w:r>
+        <w:t>3. 금융분야 인공지능 도입 유형</w:t>
       </w:r>
     </w:p>
     <w:p>
       <w:r>
-        <w:rPr>
-          <w:b/>
-          <w:sz w:val="24"/>
-        </w:rPr>
-        <w:t>1. 들어가며</w:t>
-      </w:r>
-    </w:p>
-    <w:p>
-      <w:pPr>
-        <w:ind w:left="432"/>
-      </w:pPr>
-      <w:r>
-        <w:t>AI는 인간의 지적 능력을 보완하거나 능가하며 업무 방식에 혁신을 가져오고 있습니다. 디지털 금융 플랫폼의 부상과 경쟁 심화 속에서 금융기관들은 AI 도입에 투자하여 경쟁력을 확보하려 하고 있습니다. 본 보고서는 금융 AI 시장 현황을 파악하고 미래 혁신 서비스 발굴에 인사이트를 제공하는 것을 목표로 합니다.</w:t>
+        <w:t>금융 분야에서 AI는 ① 방대한 데이터 분석을 통한 인사이트 발굴 및 신규 수익 창출, ② 개인화된 서비스 제공을 통한 고객 경험 및 가치 제고, ③ 업무 프로세스 자동화를 통한 운용 비용 절감, ④ 복잡한 금융 규제 및 컴플라이언스 대응을 위해 도입됩니다. 예를 들어, 신용평가 모델 개선, 초개인화 서비스 제공, RPA를 통한 업무 자동화, 레그테크 및 FDS 고도화 등이 이에 해당합니다.</w:t>
       </w:r>
     </w:p>
     <w:p/>
     <w:p>
+      <w:pPr>
+        <w:pStyle w:val="Heading2"/>
+      </w:pPr>
       <w:r>
-        <w:rPr>
-          <w:b/>
-          <w:sz w:val="24"/>
-        </w:rPr>
-        <w:t>2. 인공지능 시장과 금융 AI 시장 전망</w:t>
+        <w:t>4. 서비스 동향</w:t>
       </w:r>
     </w:p>
     <w:p>
-      <w:pPr>
-        <w:ind w:left="432"/>
-      </w:pPr>
       <w:r>
-        <w:t>세계 AI 시장은 2021년 581억 달러에서 2026년 3,095억 달러로 연평균 39.7% 성장할 전망이며, 금융 분야는 가장 큰 비중(19.4%)을 차지합니다. 국내 AI 시장 역시 2021년 3.2조 원에서 2026년 17.4조 원으로 연평균 40.2% 성장할 것으로 예상되며, 국내 금융 AI 시장은 2021년 6천억 원에서 2026년 3.2조 원으로 연평균 38.2% 성장할 것으로 전망됩니다.</w:t>
+        <w:t>금융권에서는 AI를 활용한 신용평가·신용대출, 자산관리·RPA, 이상거래탐지·리스크 모니터링 서비스가 활발히 제공되고 있습니다. 신용평가에서는 비금융 정보를 활용한 대안신용평가모형이 확장되고 있으며, 자산관리에서는 로보어드바이저와 RPA가 도입되어 업무 효율성을 높이고 있습니다. 이상거래탐지 시스템은 AI 기술을 활용하여 금융 사기를 예방하고 있습니다.</w:t>
       </w:r>
     </w:p>
     <w:p/>
     <w:p>
-      <w:r>
-        <w:rPr>
-          <w:b/>
-          <w:sz w:val="24"/>
-        </w:rPr>
-        <w:t>3. 금융분야 인공지능 도입 유형</w:t>
-      </w:r>
-    </w:p>
-    <w:p>
       <w:pPr>
-        <w:ind w:left="432"/>
+        <w:pStyle w:val="Heading2"/>
       </w:pPr>
       <w:r>
-        <w:t>금융 AI는 크게 네 가지 유형으로 도입됩니다: ① 방대한 데이터 분석을 통한 인사이트 발굴 및 신규 수익 창출, ② 개인화된 서비스 제공을 통한 고객 경험 및 가치 제고, ③ 업무 프로세스 자동화를 통한 운용 비용 절감, ④ 복잡한 금융 규제 및 컴플라이언스 대응입니다. 각 유형별로 구체적인 활용 사례와 기대 효과가 제시됩니다.</w:t>
-      </w:r>
-    </w:p>
-    <w:p/>
-    <w:p>
-      <w:r>
-        <w:rPr>
-          <w:b/>
-          <w:sz w:val="24"/>
-        </w:rPr>
-        <w:t>4. 서비스 동향</w:t>
-      </w:r>
-    </w:p>
-    <w:p>
-      <w:pPr>
-        <w:ind w:left="432"/>
-      </w:pPr>
-      <w:r>
-        <w:t>금융 AI 서비스는 신용평가·신용대출, 자산관리·RPA, 이상거래탐지·리스크 모니터링 등으로 나뉩니다. 특히 신용평가 분야에서는 비금융 정보를 활용한 대안신용평가모형이 확장되고 있으며, 자산관리 분야에서는 로보어드바이저와 RPA 도입이 활발합니다. 이상거래탐지 시스템은 AI 기술을 활용하여 고도화되고 있습니다.</w:t>
-      </w:r>
-    </w:p>
-    <w:p/>
-    <w:p>
-      <w:r>
-        <w:rPr>
-          <w:b/>
-          <w:sz w:val="24"/>
-        </w:rPr>
         <w:t>5. 시사점 및 향후 전망</w:t>
       </w:r>
     </w:p>
     <w:p>
-      <w:pPr>
-        <w:ind w:left="432"/>
-      </w:pPr>
       <w:r>
-        <w:t>금융권은 AI 도입을 통해 정량적, 정성적 성과를 검증하며 투자를 확대할 것으로 예상됩니다. AI는 금융 회사에는 비용 절감과 보안 강화, 소비자에게는 차별화된 서비스 제공 방향으로 진화할 것입니다. 마이데이터 사업의 출범은 금융 AI 발전 방향에 큰 영향을 미칠 것이며, AI의 안전성, 투명성, 공정성 확보를 통한 사회적 신뢰 구축이 중요합니다.</w:t>
+        <w:t>금융권은 AI 도입을 통해 정량적, 정성적 성과를 검증하며 투자를 확대할 것으로 예상되며, 관련 시장은 고성장세를 유지할 것입니다. AI는 금융 서비스의 간편화, 보안 강화, 차별화된 서비스 제공 방향으로 발전할 것이며, 마이데이터 사업 등과 연계하여 금융 AI의 발전 방향에 큰 영향을 미칠 것입니다. 또한, AI의 공정성과 투명성 확보를 통한 사회적 신뢰 구축이 중요 과제로 제시됩니다.</w:t>
       </w:r>
     </w:p>
+    <w:p/>
+    <w:tbl>
+      <w:tblPr>
+        <w:tblStyle w:val="TableGrid"/>
+        <w:tblW w:type="auto" w:w="0"/>
+        <w:tblLook w:firstColumn="1" w:firstRow="1" w:lastColumn="0" w:lastRow="0" w:noHBand="0" w:noVBand="1" w:val="04A0"/>
+      </w:tblPr>
+      <w:tblGrid>
+        <w:gridCol w:w="8640"/>
+      </w:tblGrid>
+      <w:tr>
+        <w:tc>
+          <w:tcPr>
+            <w:tcW w:type="dxa" w:w="8640"/>
+          </w:tcPr>
+          <w:p>
+            <w:r>
+              <w:rPr>
+                <w:b/>
+              </w:rPr>
+              <w:t>※ 본 보고서의 내용은 작성자 개인의 의견으로서 한국신용정보원의 공식 견해와 다를 수 있습니다. 본 보고서를 사용 또는 인용하고자 할 경우에는 출처를 명시하시기 바랍니다.</w:t>
+            </w:r>
+          </w:p>
+        </w:tc>
+      </w:tr>
+    </w:tbl>
     <w:p/>
     <w:sectPr>
       <w:pgSz w:w="12240" w:h="15840"/>

</xml_diff>